<commit_message>
docs: audit fixes — AI model/dimensions/feedback format, delete route, seed note, test users; fix compliance tab subtitle
</commit_message>
<xml_diff>
--- a/ZAM-BUILD-DOC.docx
+++ b/ZAM-BUILD-DOC.docx
@@ -367,7 +367,8 @@
     <w:tbl>
       <w:tblPr>
         <w:tblStyle w:val="Table"/>
-        <w:tblW w:type="auto" w:w="0"/>
+        <w:tblW w:type="pct" w:w="5000"/>
+        <w:tblLayout w:type="fixed"/>
         <w:tblLook w:firstRow="1" w:lastRow="0" w:firstColumn="0" w:lastColumn="0" w:noHBand="0" w:noVBand="0" w:val="0020"/>
       </w:tblPr>
       <w:tblGrid>
@@ -561,7 +562,22 @@
               <w:pStyle w:val="Compact"/>
             </w:pPr>
             <w:r>
-              <w:t xml:space="preserve">Anthropic Claude (</w:t>
+              <w:t xml:space="preserve">Anthropic Claude — model:</w:t>
+            </w:r>
+            <w:r>
+              <w:t xml:space="preserve"> </w:t>
+            </w:r>
+            <w:r>
+              <w:rPr>
+                <w:rStyle w:val="VerbatimChar"/>
+              </w:rPr>
+              <w:t xml:space="preserve">claude-opus-4-5</w:t>
+            </w:r>
+            <w:r>
+              <w:t xml:space="preserve"> </w:t>
+            </w:r>
+            <w:r>
+              <w:t xml:space="preserve">(</w:t>
             </w:r>
             <w:r>
               <w:rPr>
@@ -1336,7 +1352,7 @@
         <w:rPr>
           <w:rStyle w:val="VerbatimChar"/>
         </w:rPr>
-        <w:t xml:space="preserve">aiFeedback         String? — narrative feedback from Claude</w:t>
+        <w:t xml:space="preserve">aiFeedback         String? — JSON: { strengths[], weaknesses[], recommendation, feedback }</w:t>
       </w:r>
       <w:r>
         <w:br/>
@@ -4877,7 +4893,7 @@
         <w:t xml:space="preserve"> </w:t>
       </w:r>
       <w:r>
-        <w:t xml:space="preserve">— marks submitted, triggers synchronous AI scoring, advances user’s</w:t>
+        <w:t xml:space="preserve">— marks submitted, triggers synchronous AI scoring. In assessment mode, advances user’s</w:t>
       </w:r>
       <w:r>
         <w:t xml:space="preserve"> </w:t>
@@ -4892,7 +4908,19 @@
         <w:t xml:space="preserve"> </w:t>
       </w:r>
       <w:r>
-        <w:t xml:space="preserve">to 4 if assessment mode.</w:t>
+        <w:t xml:space="preserve">to 4 and sets</w:t>
+      </w:r>
+      <w:r>
+        <w:t xml:space="preserve"> </w:t>
+      </w:r>
+      <w:r>
+        <w:rPr>
+          <w:rStyle w:val="VerbatimChar"/>
+        </w:rPr>
+        <w:t xml:space="preserve">module3Done: true</w:t>
+      </w:r>
+      <w:r>
+        <w:t xml:space="preserve">.</w:t>
       </w:r>
     </w:p>
     <w:p>
@@ -5283,7 +5311,28 @@
         <w:t xml:space="preserve"> </w:t>
       </w:r>
       <w:r>
-        <w:t xml:space="preserve">Anthropic Claude</w:t>
+        <w:rPr>
+          <w:rStyle w:val="VerbatimChar"/>
+        </w:rPr>
+        <w:t xml:space="preserve">claude-opus-4-5</w:t>
+      </w:r>
+      <w:r>
+        <w:t xml:space="preserve"> </w:t>
+      </w:r>
+      <w:r>
+        <w:t xml:space="preserve">(via</w:t>
+      </w:r>
+      <w:r>
+        <w:t xml:space="preserve"> </w:t>
+      </w:r>
+      <w:r>
+        <w:rPr>
+          <w:rStyle w:val="VerbatimChar"/>
+        </w:rPr>
+        <w:t xml:space="preserve">@anthropic-ai/sdk</w:t>
+      </w:r>
+      <w:r>
+        <w:t xml:space="preserve">)</w:t>
       </w:r>
       <w:r>
         <w:br/>
@@ -5299,7 +5348,58 @@
         <w:t xml:space="preserve"> </w:t>
       </w:r>
       <w:r>
-        <w:t xml:space="preserve">Technical Credibility, Management Approach, Pricing, Past Performance, Compliance Awareness</w:t>
+        <w:rPr>
+          <w:rStyle w:val="VerbatimChar"/>
+        </w:rPr>
+        <w:t xml:space="preserve">technical</w:t>
+      </w:r>
+      <w:r>
+        <w:t xml:space="preserve">,</w:t>
+      </w:r>
+      <w:r>
+        <w:t xml:space="preserve"> </w:t>
+      </w:r>
+      <w:r>
+        <w:rPr>
+          <w:rStyle w:val="VerbatimChar"/>
+        </w:rPr>
+        <w:t xml:space="preserve">management</w:t>
+      </w:r>
+      <w:r>
+        <w:t xml:space="preserve">,</w:t>
+      </w:r>
+      <w:r>
+        <w:t xml:space="preserve"> </w:t>
+      </w:r>
+      <w:r>
+        <w:rPr>
+          <w:rStyle w:val="VerbatimChar"/>
+        </w:rPr>
+        <w:t xml:space="preserve">pricing</w:t>
+      </w:r>
+      <w:r>
+        <w:t xml:space="preserve">,</w:t>
+      </w:r>
+      <w:r>
+        <w:t xml:space="preserve"> </w:t>
+      </w:r>
+      <w:r>
+        <w:rPr>
+          <w:rStyle w:val="VerbatimChar"/>
+        </w:rPr>
+        <w:t xml:space="preserve">past_performance</w:t>
+      </w:r>
+      <w:r>
+        <w:t xml:space="preserve">,</w:t>
+      </w:r>
+      <w:r>
+        <w:t xml:space="preserve"> </w:t>
+      </w:r>
+      <w:r>
+        <w:rPr>
+          <w:rStyle w:val="VerbatimChar"/>
+        </w:rPr>
+        <w:t xml:space="preserve">compliance</w:t>
       </w:r>
       <w:r>
         <w:br/>
@@ -5360,7 +5460,7 @@
         <w:t xml:space="preserve"> </w:t>
       </w:r>
       <w:r>
-        <w:t xml:space="preserve">(narrative)</w:t>
+        <w:t xml:space="preserve">(JSON)</w:t>
       </w:r>
     </w:p>
     <w:p>
@@ -5408,6 +5508,128 @@
       </w:r>
       <w:r>
         <w:t xml:space="preserve">before the API response is returned. This is intentional: Vercel terminates async fire-and-forget tasks after the response is sent.</w:t>
+      </w:r>
+    </w:p>
+    <w:p>
+      <w:pPr>
+        <w:pStyle w:val="BodyText"/>
+      </w:pPr>
+      <w:r>
+        <w:rPr>
+          <w:rStyle w:val="VerbatimChar"/>
+        </w:rPr>
+        <w:t xml:space="preserve">aiFeedback</w:t>
+      </w:r>
+      <w:r>
+        <w:t xml:space="preserve"> </w:t>
+      </w:r>
+      <w:r>
+        <w:t xml:space="preserve">is stored as a JSON object with four fields:</w:t>
+      </w:r>
+      <w:r>
+        <w:t xml:space="preserve"> </w:t>
+      </w:r>
+      <w:r>
+        <w:rPr>
+          <w:rStyle w:val="VerbatimChar"/>
+        </w:rPr>
+        <w:t xml:space="preserve">strengths</w:t>
+      </w:r>
+      <w:r>
+        <w:t xml:space="preserve"> </w:t>
+      </w:r>
+      <w:r>
+        <w:t xml:space="preserve">(string array),</w:t>
+      </w:r>
+      <w:r>
+        <w:t xml:space="preserve"> </w:t>
+      </w:r>
+      <w:r>
+        <w:rPr>
+          <w:rStyle w:val="VerbatimChar"/>
+        </w:rPr>
+        <w:t xml:space="preserve">weaknesses</w:t>
+      </w:r>
+      <w:r>
+        <w:t xml:space="preserve"> </w:t>
+      </w:r>
+      <w:r>
+        <w:t xml:space="preserve">(string array),</w:t>
+      </w:r>
+      <w:r>
+        <w:t xml:space="preserve"> </w:t>
+      </w:r>
+      <w:r>
+        <w:rPr>
+          <w:rStyle w:val="VerbatimChar"/>
+        </w:rPr>
+        <w:t xml:space="preserve">recommendation</w:t>
+      </w:r>
+      <w:r>
+        <w:t xml:space="preserve"> </w:t>
+      </w:r>
+      <w:r>
+        <w:t xml:space="preserve">(one of:</w:t>
+      </w:r>
+      <w:r>
+        <w:t xml:space="preserve"> </w:t>
+      </w:r>
+      <w:r>
+        <w:t xml:space="preserve">“Award”</w:t>
+      </w:r>
+      <w:r>
+        <w:t xml:space="preserve"> </w:t>
+      </w:r>
+      <w:r>
+        <w:t xml:space="preserve">/</w:t>
+      </w:r>
+      <w:r>
+        <w:t xml:space="preserve"> </w:t>
+      </w:r>
+      <w:r>
+        <w:t xml:space="preserve">“High Competitive”</w:t>
+      </w:r>
+      <w:r>
+        <w:t xml:space="preserve"> </w:t>
+      </w:r>
+      <w:r>
+        <w:t xml:space="preserve">/</w:t>
+      </w:r>
+      <w:r>
+        <w:t xml:space="preserve"> </w:t>
+      </w:r>
+      <w:r>
+        <w:t xml:space="preserve">“Competitive”</w:t>
+      </w:r>
+      <w:r>
+        <w:t xml:space="preserve"> </w:t>
+      </w:r>
+      <w:r>
+        <w:t xml:space="preserve">/</w:t>
+      </w:r>
+      <w:r>
+        <w:t xml:space="preserve"> </w:t>
+      </w:r>
+      <w:r>
+        <w:t xml:space="preserve">“Non-Competitive”</w:t>
+      </w:r>
+      <w:r>
+        <w:t xml:space="preserve">), and</w:t>
+      </w:r>
+      <w:r>
+        <w:t xml:space="preserve"> </w:t>
+      </w:r>
+      <w:r>
+        <w:rPr>
+          <w:rStyle w:val="VerbatimChar"/>
+        </w:rPr>
+        <w:t xml:space="preserve">feedback</w:t>
+      </w:r>
+      <w:r>
+        <w:t xml:space="preserve"> </w:t>
+      </w:r>
+      <w:r>
+        <w:t xml:space="preserve">(narrative string).</w:t>
       </w:r>
     </w:p>
     <w:p>
@@ -7150,7 +7372,8 @@
     <w:tbl>
       <w:tblPr>
         <w:tblStyle w:val="Table"/>
-        <w:tblW w:type="auto" w:w="0"/>
+        <w:tblW w:type="pct" w:w="5000"/>
+        <w:tblLayout w:type="fixed"/>
         <w:tblLook w:firstRow="1" w:lastRow="0" w:firstColumn="0" w:lastColumn="0" w:noHBand="0" w:noVBand="0" w:val="0020"/>
       </w:tblPr>
       <w:tblGrid>
@@ -7370,18 +7593,33 @@
               <w:rPr>
                 <w:rStyle w:val="VerbatimChar"/>
               </w:rPr>
-              <w:t xml:space="preserve">/api/admin/users/[id]</w:t>
-            </w:r>
-          </w:p>
-        </w:tc>
-        <w:tc>
-          <w:tcPr/>
-          <w:p>
-            <w:pPr>
-              <w:pStyle w:val="Compact"/>
-            </w:pPr>
-            <w:r>
-              <w:t xml:space="preserve">Delete VP account</w:t>
+              <w:t xml:space="preserve">/api/admin/users</w:t>
+            </w:r>
+          </w:p>
+        </w:tc>
+        <w:tc>
+          <w:tcPr/>
+          <w:p>
+            <w:pPr>
+              <w:pStyle w:val="Compact"/>
+            </w:pPr>
+            <w:r>
+              <w:t xml:space="preserve">Delete VP account (user</w:t>
+            </w:r>
+            <w:r>
+              <w:t xml:space="preserve"> </w:t>
+            </w:r>
+            <w:r>
+              <w:rPr>
+                <w:rStyle w:val="VerbatimChar"/>
+              </w:rPr>
+              <w:t xml:space="preserve">id</w:t>
+            </w:r>
+            <w:r>
+              <w:t xml:space="preserve"> </w:t>
+            </w:r>
+            <w:r>
+              <w:t xml:space="preserve">passed in request body, not URL)</w:t>
             </w:r>
           </w:p>
         </w:tc>
@@ -7702,7 +7940,82 @@
         <w:t xml:space="preserve">solicNumber</w:t>
       </w:r>
       <w:r>
-        <w:t xml:space="preserve">).</w:t>
+        <w:t xml:space="preserve">). The</w:t>
+      </w:r>
+      <w:r>
+        <w:t xml:space="preserve"> </w:t>
+      </w:r>
+      <w:r>
+        <w:rPr>
+          <w:rStyle w:val="VerbatimChar"/>
+        </w:rPr>
+        <w:t xml:space="preserve">prisma.seed</w:t>
+      </w:r>
+      <w:r>
+        <w:t xml:space="preserve"> </w:t>
+      </w:r>
+      <w:r>
+        <w:t xml:space="preserve">entry in</w:t>
+      </w:r>
+      <w:r>
+        <w:t xml:space="preserve"> </w:t>
+      </w:r>
+      <w:r>
+        <w:rPr>
+          <w:rStyle w:val="VerbatimChar"/>
+        </w:rPr>
+        <w:t xml:space="preserve">package.json</w:t>
+      </w:r>
+      <w:r>
+        <w:t xml:space="preserve"> </w:t>
+      </w:r>
+      <w:r>
+        <w:t xml:space="preserve">only registers</w:t>
+      </w:r>
+      <w:r>
+        <w:t xml:space="preserve"> </w:t>
+      </w:r>
+      <w:r>
+        <w:rPr>
+          <w:rStyle w:val="VerbatimChar"/>
+        </w:rPr>
+        <w:t xml:space="preserve">seed.ts</w:t>
+      </w:r>
+      <w:r>
+        <w:t xml:space="preserve"> </w:t>
+      </w:r>
+      <w:r>
+        <w:t xml:space="preserve">— run</w:t>
+      </w:r>
+      <w:r>
+        <w:t xml:space="preserve"> </w:t>
+      </w:r>
+      <w:r>
+        <w:rPr>
+          <w:rStyle w:val="VerbatimChar"/>
+        </w:rPr>
+        <w:t xml:space="preserve">seed-vehicles.ts</w:t>
+      </w:r>
+      <w:r>
+        <w:t xml:space="preserve"> </w:t>
+      </w:r>
+      <w:r>
+        <w:t xml:space="preserve">manually using the same</w:t>
+      </w:r>
+      <w:r>
+        <w:t xml:space="preserve"> </w:t>
+      </w:r>
+      <w:r>
+        <w:rPr>
+          <w:rStyle w:val="VerbatimChar"/>
+        </w:rPr>
+        <w:t xml:space="preserve">ts-node</w:t>
+      </w:r>
+      <w:r>
+        <w:t xml:space="preserve"> </w:t>
+      </w:r>
+      <w:r>
+        <w:t xml:space="preserve">command.</w:t>
       </w:r>
     </w:p>
     <w:p>
@@ -8648,59 +8961,88 @@
           </w:p>
         </w:tc>
       </w:tr>
+    </w:tbl>
+    <w:p>
+      <w:pPr>
+        <w:pStyle w:val="BodyText"/>
+      </w:pPr>
+      <w:r>
+        <w:t xml:space="preserve">VP test users are</w:t>
+      </w:r>
+      <w:r>
+        <w:t xml:space="preserve"> </w:t>
+      </w:r>
+      <w:r>
+        <w:rPr>
+          <w:b/>
+          <w:bCs/>
+        </w:rPr>
+        <w:t xml:space="preserve">not seeded</w:t>
+      </w:r>
+      <w:r>
+        <w:t xml:space="preserve"> </w:t>
+      </w:r>
+      <w:r>
+        <w:t xml:space="preserve">— they are created via Admin → Users. The seed script only creates the admin account. The following accounts exist in the live Neon DB (created via admin UI):</w:t>
+      </w:r>
+    </w:p>
+    <w:tbl>
+      <w:tblPr>
+        <w:tblStyle w:val="Table"/>
+        <w:tblW w:type="auto" w:w="0"/>
+        <w:tblLook w:firstRow="1" w:lastRow="0" w:firstColumn="0" w:lastColumn="0" w:noHBand="0" w:noVBand="0" w:val="0020"/>
+      </w:tblPr>
+      <w:tblGrid>
+        <w:gridCol w:w="1980"/>
+        <w:gridCol w:w="1980"/>
+        <w:gridCol w:w="1980"/>
+        <w:gridCol w:w="1980"/>
+      </w:tblGrid>
       <w:tr>
-        <w:tc>
-          <w:tcPr/>
-          <w:p>
-            <w:pPr>
-              <w:pStyle w:val="Compact"/>
-            </w:pPr>
-            <w:r>
-              <w:t xml:space="preserve">Demetrios</w:t>
-            </w:r>
-          </w:p>
-        </w:tc>
-        <w:tc>
-          <w:tcPr/>
-          <w:p>
-            <w:pPr>
-              <w:pStyle w:val="Compact"/>
-            </w:pPr>
-            <w:r>
-              <w:t xml:space="preserve">demetrios@kdt.mil</w:t>
-            </w:r>
-          </w:p>
-        </w:tc>
-        <w:tc>
-          <w:tcPr/>
-          <w:p>
-            <w:pPr>
-              <w:pStyle w:val="Compact"/>
-            </w:pPr>
-            <w:r>
-              <w:t xml:space="preserve">KDT-Demo2026!</w:t>
-            </w:r>
-          </w:p>
-        </w:tc>
-        <w:tc>
-          <w:tcPr/>
-          <w:p>
-            <w:pPr>
-              <w:pStyle w:val="Compact"/>
-            </w:pPr>
-            <w:r>
-              <w:t xml:space="preserve">vp</w:t>
-            </w:r>
-          </w:p>
-        </w:tc>
-        <w:tc>
-          <w:tcPr/>
-          <w:p>
-            <w:pPr>
-              <w:pStyle w:val="Compact"/>
-            </w:pPr>
-            <w:r>
-              <w:t xml:space="preserve">Multiple sessions across vehicles</w:t>
+        <w:trPr>
+          <w:tblHeader w:val="on"/>
+        </w:trPr>
+        <w:tc>
+          <w:tcPr/>
+          <w:p>
+            <w:pPr>
+              <w:pStyle w:val="Compact"/>
+            </w:pPr>
+            <w:r>
+              <w:t xml:space="preserve">Name</w:t>
+            </w:r>
+          </w:p>
+        </w:tc>
+        <w:tc>
+          <w:tcPr/>
+          <w:p>
+            <w:pPr>
+              <w:pStyle w:val="Compact"/>
+            </w:pPr>
+            <w:r>
+              <w:t xml:space="preserve">Email</w:t>
+            </w:r>
+          </w:p>
+        </w:tc>
+        <w:tc>
+          <w:tcPr/>
+          <w:p>
+            <w:pPr>
+              <w:pStyle w:val="Compact"/>
+            </w:pPr>
+            <w:r>
+              <w:t xml:space="preserve">Role</w:t>
+            </w:r>
+          </w:p>
+        </w:tc>
+        <w:tc>
+          <w:tcPr/>
+          <w:p>
+            <w:pPr>
+              <w:pStyle w:val="Compact"/>
+            </w:pPr>
+            <w:r>
+              <w:t xml:space="preserve">Notes</w:t>
             </w:r>
           </w:p>
         </w:tc>
@@ -8713,29 +9055,18 @@
               <w:pStyle w:val="Compact"/>
             </w:pPr>
             <w:r>
-              <w:t xml:space="preserve">Clark</w:t>
-            </w:r>
-          </w:p>
-        </w:tc>
-        <w:tc>
-          <w:tcPr/>
-          <w:p>
-            <w:pPr>
-              <w:pStyle w:val="Compact"/>
-            </w:pPr>
-            <w:r>
-              <w:t xml:space="preserve">clark@kdt.mil</w:t>
-            </w:r>
-          </w:p>
-        </w:tc>
-        <w:tc>
-          <w:tcPr/>
-          <w:p>
-            <w:pPr>
-              <w:pStyle w:val="Compact"/>
-            </w:pPr>
-            <w:r>
-              <w:t xml:space="preserve">KDT-Demo2026!</w:t>
+              <w:t xml:space="preserve">Demetrios Tsirigotis</w:t>
+            </w:r>
+          </w:p>
+        </w:tc>
+        <w:tc>
+          <w:tcPr/>
+          <w:p>
+            <w:pPr>
+              <w:pStyle w:val="Compact"/>
+            </w:pPr>
+            <w:r>
+              <w:t xml:space="preserve">demetrios.tsirigotis@kdt.guv</w:t>
             </w:r>
           </w:p>
         </w:tc>
@@ -8757,7 +9088,7 @@
               <w:pStyle w:val="Compact"/>
             </w:pPr>
             <w:r>
-              <w:t xml:space="preserve">Active</w:t>
+              <w:t xml:space="preserve">—</w:t>
             </w:r>
           </w:p>
         </w:tc>
@@ -8770,29 +9101,18 @@
               <w:pStyle w:val="Compact"/>
             </w:pPr>
             <w:r>
-              <w:t xml:space="preserve">Simeon</w:t>
-            </w:r>
-          </w:p>
-        </w:tc>
-        <w:tc>
-          <w:tcPr/>
-          <w:p>
-            <w:pPr>
-              <w:pStyle w:val="Compact"/>
-            </w:pPr>
-            <w:r>
-              <w:t xml:space="preserve">simeon@kdt.mil</w:t>
-            </w:r>
-          </w:p>
-        </w:tc>
-        <w:tc>
-          <w:tcPr/>
-          <w:p>
-            <w:pPr>
-              <w:pStyle w:val="Compact"/>
-            </w:pPr>
-            <w:r>
-              <w:t xml:space="preserve">KDT-Demo2026!</w:t>
+              <w:t xml:space="preserve">Clark Donalson</w:t>
+            </w:r>
+          </w:p>
+        </w:tc>
+        <w:tc>
+          <w:tcPr/>
+          <w:p>
+            <w:pPr>
+              <w:pStyle w:val="Compact"/>
+            </w:pPr>
+            <w:r>
+              <w:t xml:space="preserve">clark.donalson@kdt.guv</w:t>
             </w:r>
           </w:p>
         </w:tc>
@@ -8814,7 +9134,7 @@
               <w:pStyle w:val="Compact"/>
             </w:pPr>
             <w:r>
-              <w:t xml:space="preserve">Minimal activity</w:t>
+              <w:t xml:space="preserve">—</w:t>
             </w:r>
           </w:p>
         </w:tc>
@@ -8827,29 +9147,18 @@
               <w:pStyle w:val="Compact"/>
             </w:pPr>
             <w:r>
-              <w:t xml:space="preserve">Demetrios Tsirigotis</w:t>
-            </w:r>
-          </w:p>
-        </w:tc>
-        <w:tc>
-          <w:tcPr/>
-          <w:p>
-            <w:pPr>
-              <w:pStyle w:val="Compact"/>
-            </w:pPr>
-            <w:r>
-              <w:t xml:space="preserve">demetrios.tsirigotis@kdt.guv</w:t>
-            </w:r>
-          </w:p>
-        </w:tc>
-        <w:tc>
-          <w:tcPr/>
-          <w:p>
-            <w:pPr>
-              <w:pStyle w:val="Compact"/>
-            </w:pPr>
-            <w:r>
-              <w:t xml:space="preserve">(set on creation)</w:t>
+              <w:t xml:space="preserve">Austin Losurdo</w:t>
+            </w:r>
+          </w:p>
+        </w:tc>
+        <w:tc>
+          <w:tcPr/>
+          <w:p>
+            <w:pPr>
+              <w:pStyle w:val="Compact"/>
+            </w:pPr>
+            <w:r>
+              <w:t xml:space="preserve">austin.losurdo@kdt.guv</w:t>
             </w:r>
           </w:p>
         </w:tc>
@@ -8884,29 +9193,18 @@
               <w:pStyle w:val="Compact"/>
             </w:pPr>
             <w:r>
-              <w:t xml:space="preserve">Clark Donalson</w:t>
-            </w:r>
-          </w:p>
-        </w:tc>
-        <w:tc>
-          <w:tcPr/>
-          <w:p>
-            <w:pPr>
-              <w:pStyle w:val="Compact"/>
-            </w:pPr>
-            <w:r>
-              <w:t xml:space="preserve">clark.donalson@kdt.guv</w:t>
-            </w:r>
-          </w:p>
-        </w:tc>
-        <w:tc>
-          <w:tcPr/>
-          <w:p>
-            <w:pPr>
-              <w:pStyle w:val="Compact"/>
-            </w:pPr>
-            <w:r>
-              <w:t xml:space="preserve">(set on creation)</w:t>
+              <w:t xml:space="preserve">Nicholas Norman</w:t>
+            </w:r>
+          </w:p>
+        </w:tc>
+        <w:tc>
+          <w:tcPr/>
+          <w:p>
+            <w:pPr>
+              <w:pStyle w:val="Compact"/>
+            </w:pPr>
+            <w:r>
+              <w:t xml:space="preserve">nicholas.norman@kdt.guv</w:t>
             </w:r>
           </w:p>
         </w:tc>
@@ -8928,7 +9226,7 @@
               <w:pStyle w:val="Compact"/>
             </w:pPr>
             <w:r>
-              <w:t xml:space="preserve">—</w:t>
+              <w:t xml:space="preserve">Active</w:t>
             </w:r>
           </w:p>
         </w:tc>
@@ -8941,29 +9239,18 @@
               <w:pStyle w:val="Compact"/>
             </w:pPr>
             <w:r>
-              <w:t xml:space="preserve">Austin Losurdo</w:t>
-            </w:r>
-          </w:p>
-        </w:tc>
-        <w:tc>
-          <w:tcPr/>
-          <w:p>
-            <w:pPr>
-              <w:pStyle w:val="Compact"/>
-            </w:pPr>
-            <w:r>
-              <w:t xml:space="preserve">austin.losurdo@kdt.guv</w:t>
-            </w:r>
-          </w:p>
-        </w:tc>
-        <w:tc>
-          <w:tcPr/>
-          <w:p>
-            <w:pPr>
-              <w:pStyle w:val="Compact"/>
-            </w:pPr>
-            <w:r>
-              <w:t xml:space="preserve">(set on creation)</w:t>
+              <w:t xml:space="preserve">Santiago Telleria</w:t>
+            </w:r>
+          </w:p>
+        </w:tc>
+        <w:tc>
+          <w:tcPr/>
+          <w:p>
+            <w:pPr>
+              <w:pStyle w:val="Compact"/>
+            </w:pPr>
+            <w:r>
+              <w:t xml:space="preserve">santiago.telleria@kdt.guv</w:t>
             </w:r>
           </w:p>
         </w:tc>
@@ -8985,7 +9272,7 @@
               <w:pStyle w:val="Compact"/>
             </w:pPr>
             <w:r>
-              <w:t xml:space="preserve">—</w:t>
+              <w:t xml:space="preserve">Active</w:t>
             </w:r>
           </w:p>
         </w:tc>
@@ -8998,120 +9285,6 @@
               <w:pStyle w:val="Compact"/>
             </w:pPr>
             <w:r>
-              <w:t xml:space="preserve">Nicholas Norman</w:t>
-            </w:r>
-          </w:p>
-        </w:tc>
-        <w:tc>
-          <w:tcPr/>
-          <w:p>
-            <w:pPr>
-              <w:pStyle w:val="Compact"/>
-            </w:pPr>
-            <w:r>
-              <w:t xml:space="preserve">nicholas.norman@kdt.guv</w:t>
-            </w:r>
-          </w:p>
-        </w:tc>
-        <w:tc>
-          <w:tcPr/>
-          <w:p>
-            <w:pPr>
-              <w:pStyle w:val="Compact"/>
-            </w:pPr>
-            <w:r>
-              <w:t xml:space="preserve">(set on creation)</w:t>
-            </w:r>
-          </w:p>
-        </w:tc>
-        <w:tc>
-          <w:tcPr/>
-          <w:p>
-            <w:pPr>
-              <w:pStyle w:val="Compact"/>
-            </w:pPr>
-            <w:r>
-              <w:t xml:space="preserve">vp</w:t>
-            </w:r>
-          </w:p>
-        </w:tc>
-        <w:tc>
-          <w:tcPr/>
-          <w:p>
-            <w:pPr>
-              <w:pStyle w:val="Compact"/>
-            </w:pPr>
-            <w:r>
-              <w:t xml:space="preserve">Active</w:t>
-            </w:r>
-          </w:p>
-        </w:tc>
-      </w:tr>
-      <w:tr>
-        <w:tc>
-          <w:tcPr/>
-          <w:p>
-            <w:pPr>
-              <w:pStyle w:val="Compact"/>
-            </w:pPr>
-            <w:r>
-              <w:t xml:space="preserve">Santiago Telleria</w:t>
-            </w:r>
-          </w:p>
-        </w:tc>
-        <w:tc>
-          <w:tcPr/>
-          <w:p>
-            <w:pPr>
-              <w:pStyle w:val="Compact"/>
-            </w:pPr>
-            <w:r>
-              <w:t xml:space="preserve">santiago.telleria@kdt.guv</w:t>
-            </w:r>
-          </w:p>
-        </w:tc>
-        <w:tc>
-          <w:tcPr/>
-          <w:p>
-            <w:pPr>
-              <w:pStyle w:val="Compact"/>
-            </w:pPr>
-            <w:r>
-              <w:t xml:space="preserve">(set on creation)</w:t>
-            </w:r>
-          </w:p>
-        </w:tc>
-        <w:tc>
-          <w:tcPr/>
-          <w:p>
-            <w:pPr>
-              <w:pStyle w:val="Compact"/>
-            </w:pPr>
-            <w:r>
-              <w:t xml:space="preserve">vp</w:t>
-            </w:r>
-          </w:p>
-        </w:tc>
-        <w:tc>
-          <w:tcPr/>
-          <w:p>
-            <w:pPr>
-              <w:pStyle w:val="Compact"/>
-            </w:pPr>
-            <w:r>
-              <w:t xml:space="preserve">Active</w:t>
-            </w:r>
-          </w:p>
-        </w:tc>
-      </w:tr>
-      <w:tr>
-        <w:tc>
-          <w:tcPr/>
-          <w:p>
-            <w:pPr>
-              <w:pStyle w:val="Compact"/>
-            </w:pPr>
-            <w:r>
               <w:t xml:space="preserve">Matthew McCalla</w:t>
             </w:r>
           </w:p>
@@ -9124,17 +9297,6 @@
             </w:pPr>
             <w:r>
               <w:t xml:space="preserve">matthew.mccalla@kdt.guv</w:t>
-            </w:r>
-          </w:p>
-        </w:tc>
-        <w:tc>
-          <w:tcPr/>
-          <w:p>
-            <w:pPr>
-              <w:pStyle w:val="Compact"/>
-            </w:pPr>
-            <w:r>
-              <w:t xml:space="preserve">(set on creation)</w:t>
             </w:r>
           </w:p>
         </w:tc>
@@ -9167,7 +9329,7 @@
         <w:pStyle w:val="BodyText"/>
       </w:pPr>
       <w:r>
-        <w:t xml:space="preserve">New VPs can be created from the Admin → Users page. No seed script required.</w:t>
+        <w:t xml:space="preserve">Passwords are set at creation time by the admin. To reset a password, delete and recreate the user via Admin → Users.</w:t>
       </w:r>
     </w:p>
     <w:bookmarkEnd w:id="62"/>

</xml_diff>